<commit_message>
Sincronizar pujas en vivo y cambio seguro de subasta
</commit_message>
<xml_diff>
--- a/docs/Manual_Flujos_y_Pruebas_AuctIO.docx
+++ b/docs/Manual_Flujos_y_Pruebas_AuctIO.docx
@@ -1858,7 +1858,7 @@
           <w:color w:val="071827"/>
           <w:sz w:val="21"/>
         </w:rPr>
-        <w:t>5. Abrir Historial y verificar dos fichas independientes.</w:t>
+        <w:t>5. Comprobar que mejor oferta y liderazgo cambian solos en dos teléfonos.</w:t>
       </w:r>
     </w:p>
     <w:p>
@@ -1871,7 +1871,20 @@
           <w:color w:val="071827"/>
           <w:sz w:val="21"/>
         </w:rPr>
-        <w:t>6. Tocar cada ficha para volver a su subasta.</w:t>
+        <w:t>6. Abrir Historial y verificar dos fichas independientes actualizadas automáticamente.</w:t>
+      </w:r>
+    </w:p>
+    <w:p>
+      <w:pPr>
+        <w:spacing w:after="120" w:line="300" w:lineRule="auto"/>
+      </w:pPr>
+      <w:r>
+        <w:rPr>
+          <w:rFonts w:ascii="Calibri" w:hAnsi="Calibri"/>
+          <w:color w:val="071827"/>
+          <w:sz w:val="21"/>
+        </w:rPr>
+        <w:t>7. Tocar cada ficha para volver a su subasta.</w:t>
       </w:r>
     </w:p>
     <w:p>
@@ -1916,6 +1929,21 @@
           <w:color w:val="071827"/>
           <w:sz w:val="21"/>
         </w:rPr>
+        <w:t>SSE actualiza la subasta cada 2 s y se reconecta si se corta la red.</w:t>
+      </w:r>
+    </w:p>
+    <w:p>
+      <w:pPr>
+        <w:pStyle w:val="ListBullet"/>
+        <w:spacing w:after="80" w:line="300" w:lineRule="auto"/>
+        <w:ind w:left="540" w:hanging="271"/>
+      </w:pPr>
+      <w:r>
+        <w:rPr>
+          <w:rFonts w:ascii="Calibri" w:hAnsi="Calibri"/>
+          <w:color w:val="071827"/>
+          <w:sz w:val="21"/>
+        </w:rPr>
         <w:t>La puja genera un aviso y nunca reemplaza a otra participación.</w:t>
       </w:r>
     </w:p>
@@ -1976,7 +2004,22 @@
           <w:color w:val="071827"/>
           <w:sz w:val="21"/>
         </w:rPr>
-        <w:t>Intentar entrar a otra subasta sin salir: bloqueo informativo.</w:t>
+        <w:t>Entrar a otra subasta sin haber ofertado: debe permitir confirmar el cambio.</w:t>
+      </w:r>
+    </w:p>
+    <w:p>
+      <w:pPr>
+        <w:pStyle w:val="ListBullet"/>
+        <w:spacing w:after="80" w:line="300" w:lineRule="auto"/>
+        <w:ind w:left="540" w:hanging="271"/>
+      </w:pPr>
+      <w:r>
+        <w:rPr>
+          <w:rFonts w:ascii="Calibri" w:hAnsi="Calibri"/>
+          <w:color w:val="071827"/>
+          <w:sz w:val="21"/>
+        </w:rPr>
+        <w:t>Intentar cambiar luego de pujar: debe conservar el vínculo y explicar el motivo.</w:t>
       </w:r>
     </w:p>
     <w:p>

</xml_diff>

<commit_message>
Restringir pujas al lote activo
</commit_message>
<xml_diff>
--- a/docs/Manual_Flujos_y_Pruebas_AuctIO.docx
+++ b/docs/Manual_Flujos_y_Pruebas_AuctIO.docx
@@ -1819,7 +1819,7 @@
           <w:color w:val="071827"/>
           <w:sz w:val="21"/>
         </w:rPr>
-        <w:t>2. Recorrer todos los lotes del catálogo; las imágenes deben conservar proporción.</w:t>
+        <w:t>2. Recorrer todos los lotes; solo el actual debe mostrar PUJAR AHORA y los próximos, ESPERANDO TURNO.</w:t>
       </w:r>
     </w:p>
     <w:p>
@@ -1832,7 +1832,7 @@
           <w:color w:val="071827"/>
           <w:sz w:val="21"/>
         </w:rPr>
-        <w:t>3. Pujar por un primer lote y esperar confirmación del servidor.</w:t>
+        <w:t>3. Pujar por el lote activo y esperar confirmación del servidor.</w:t>
       </w:r>
     </w:p>
     <w:p>
@@ -1845,7 +1845,7 @@
           <w:color w:val="071827"/>
           <w:sz w:val="21"/>
         </w:rPr>
-        <w:t>4. Pujar por un segundo lote de la misma subasta.</w:t>
+        <w:t>4. Esperar que el siguiente lote quede activo antes de ofertar por él.</w:t>
       </w:r>
     </w:p>
     <w:p>
@@ -1914,7 +1914,22 @@
           <w:color w:val="071827"/>
           <w:sz w:val="21"/>
         </w:rPr>
-        <w:t>Cada lote muestra oferta propia, mejor oferta actual, cantidad de pujas y estado GANADO/LIDERANDO/SUPERADA.</w:t>
+        <w:t>Nunca hay dos lotes habilitados para pujar al mismo tiempo.</w:t>
+      </w:r>
+    </w:p>
+    <w:p>
+      <w:pPr>
+        <w:pStyle w:val="ListBullet"/>
+        <w:spacing w:after="80" w:line="300" w:lineRule="auto"/>
+        <w:ind w:left="540" w:hanging="271"/>
+      </w:pPr>
+      <w:r>
+        <w:rPr>
+          <w:rFonts w:ascii="Calibri" w:hAnsi="Calibri"/>
+          <w:color w:val="071827"/>
+          <w:sz w:val="21"/>
+        </w:rPr>
+        <w:t>Cada participación conserva oferta propia, mejor actual y estado GANADO/LIDERANDO/SUPERADA.</w:t>
       </w:r>
     </w:p>
     <w:p>
@@ -1960,6 +1975,36 @@
           <w:sz w:val="26"/>
         </w:rPr>
         <w:t>Controles negativos</w:t>
+      </w:r>
+    </w:p>
+    <w:p>
+      <w:pPr>
+        <w:pStyle w:val="ListBullet"/>
+        <w:spacing w:after="80" w:line="300" w:lineRule="auto"/>
+        <w:ind w:left="540" w:hanging="271"/>
+      </w:pPr>
+      <w:r>
+        <w:rPr>
+          <w:rFonts w:ascii="Calibri" w:hAnsi="Calibri"/>
+          <w:color w:val="071827"/>
+          <w:sz w:val="21"/>
+        </w:rPr>
+        <w:t>Tocar ESPERANDO TURNO: debe explicar que solo se oferta por el lote activo.</w:t>
+      </w:r>
+    </w:p>
+    <w:p>
+      <w:pPr>
+        <w:pStyle w:val="ListBullet"/>
+        <w:spacing w:after="80" w:line="300" w:lineRule="auto"/>
+        <w:ind w:left="540" w:hanging="271"/>
+      </w:pPr>
+      <w:r>
+        <w:rPr>
+          <w:rFonts w:ascii="Calibri" w:hAnsi="Calibri"/>
+          <w:color w:val="071827"/>
+          <w:sz w:val="21"/>
+        </w:rPr>
+        <w:t>Forzar por API una puja a un lote futuro: HTTP 409 sin insertar.</w:t>
       </w:r>
     </w:p>
     <w:p>

</xml_diff>

<commit_message>
Sincronizar múltiples lotes por WebSocket
</commit_message>
<xml_diff>
--- a/docs/Manual_Flujos_y_Pruebas_AuctIO.docx
+++ b/docs/Manual_Flujos_y_Pruebas_AuctIO.docx
@@ -1819,7 +1819,7 @@
           <w:color w:val="071827"/>
           <w:sz w:val="21"/>
         </w:rPr>
-        <w:t>2. Recorrer todos los lotes; solo el actual debe mostrar PUJAR AHORA y los próximos, ESPERANDO TURNO.</w:t>
+        <w:t>2. Recorrer todos los lotes abiertos; cada uno debe mostrar PUJAR POR ESTE LOTE.</w:t>
       </w:r>
     </w:p>
     <w:p>
@@ -1832,7 +1832,7 @@
           <w:color w:val="071827"/>
           <w:sz w:val="21"/>
         </w:rPr>
-        <w:t>3. Pujar por el lote activo y esperar confirmación del servidor.</w:t>
+        <w:t>3. Pujar por un primer lote y esperar confirmación del servidor.</w:t>
       </w:r>
     </w:p>
     <w:p>
@@ -1845,7 +1845,7 @@
           <w:color w:val="071827"/>
           <w:sz w:val="21"/>
         </w:rPr>
-        <w:t>4. Esperar que el siguiente lote quede activo antes de ofertar por él.</w:t>
+        <w:t>4. Sin salir de la subasta, pujar por otro lote abierto del mismo catálogo.</w:t>
       </w:r>
     </w:p>
     <w:p>
@@ -1858,7 +1858,7 @@
           <w:color w:val="071827"/>
           <w:sz w:val="21"/>
         </w:rPr>
-        <w:t>5. Comprobar que mejor oferta y liderazgo cambian solos en dos teléfonos.</w:t>
+        <w:t>5. Comprobar que mejores ofertas y liderazgos cambian solos en dos teléfonos.</w:t>
       </w:r>
     </w:p>
     <w:p>
@@ -1914,7 +1914,7 @@
           <w:color w:val="071827"/>
           <w:sz w:val="21"/>
         </w:rPr>
-        <w:t>Nunca hay dos lotes habilitados para pujar al mismo tiempo.</w:t>
+        <w:t>Puede haber varios lotes recibiendo pujas simultáneamente dentro del catálogo.</w:t>
       </w:r>
     </w:p>
     <w:p>
@@ -1929,7 +1929,7 @@
           <w:color w:val="071827"/>
           <w:sz w:val="21"/>
         </w:rPr>
-        <w:t>Cada participación conserva oferta propia, mejor actual y estado GANADO/LIDERANDO/SUPERADA.</w:t>
+        <w:t>Cada lote conserva oferta propia, mejor actual y estado GANADO/LIDERANDO/SUPERADA.</w:t>
       </w:r>
     </w:p>
     <w:p>
@@ -1944,7 +1944,7 @@
           <w:color w:val="071827"/>
           <w:sz w:val="21"/>
         </w:rPr>
-        <w:t>SSE actualiza la subasta cada 2 s y se reconecta si se corta la red.</w:t>
+        <w:t>WebSocket sincroniza el catálogo y se reconecta si se corta la red.</w:t>
       </w:r>
     </w:p>
     <w:p>
@@ -1989,22 +1989,7 @@
           <w:color w:val="071827"/>
           <w:sz w:val="21"/>
         </w:rPr>
-        <w:t>Tocar ESPERANDO TURNO: debe explicar que solo se oferta por el lote activo.</w:t>
-      </w:r>
-    </w:p>
-    <w:p>
-      <w:pPr>
-        <w:pStyle w:val="ListBullet"/>
-        <w:spacing w:after="80" w:line="300" w:lineRule="auto"/>
-        <w:ind w:left="540" w:hanging="271"/>
-      </w:pPr>
-      <w:r>
-        <w:rPr>
-          <w:rFonts w:ascii="Calibri" w:hAnsi="Calibri"/>
-          <w:color w:val="071827"/>
-          <w:sz w:val="21"/>
-        </w:rPr>
-        <w:t>Forzar por API una puja a un lote futuro: HTTP 409 sin insertar.</w:t>
+        <w:t>Abrir dos teléfonos en la misma subasta: ambos deben recibir el mismo snapshot por WebSocket.</w:t>
       </w:r>
     </w:p>
     <w:p>

</xml_diff>

<commit_message>
Mejorar panel admin y guia punta a punta
</commit_message>
<xml_diff>
--- a/docs/Manual_Flujos_y_Pruebas_AuctIO.docx
+++ b/docs/Manual_Flujos_y_Pruebas_AuctIO.docx
@@ -10,7 +10,7 @@
         <w:drawing>
           <wp:inline xmlns:a="http://schemas.openxmlformats.org/drawingml/2006/main" xmlns:pic="http://schemas.openxmlformats.org/drawingml/2006/picture">
             <wp:extent cx="1051560" cy="1051560"/>
-            <wp:docPr id="1" name="Picture 1"/>
+            <wp:docPr id="1" name="Picture 1" descr="Logotipo de Auct.io con martillo de subastas"/>
             <wp:cNvGraphicFramePr>
               <a:graphicFrameLocks noChangeAspect="1"/>
             </wp:cNvGraphicFramePr>
@@ -108,7 +108,7 @@
           <w:color w:val="475569"/>
           <w:sz w:val="20"/>
         </w:rPr>
-        <w:t>Revisión integral · 27 de junio de 2026</w:t>
+        <w:t>Revisión integral · 27 de junio de 2026 · versión final</w:t>
       </w:r>
     </w:p>
     <w:tbl>
@@ -736,7 +736,7 @@
           <w:color w:val="071827"/>
           <w:sz w:val="26"/>
         </w:rPr>
-        <w:t>Recorrido sugerido de 12 minutos</w:t>
+        <w:t>Recorrido sugerido de 15 minutos</w:t>
       </w:r>
     </w:p>
     <w:p>
@@ -766,7 +766,22 @@
           <w:color w:val="071827"/>
           <w:sz w:val="21"/>
         </w:rPr>
-        <w:t>Abrir una subasta y pujar por dos lotes distintos.</w:t>
+        <w:t>Abrir Fotografía &amp; Tecnología y mostrar cuatro relojes e historiales independientes.</w:t>
+      </w:r>
+    </w:p>
+    <w:p>
+      <w:pPr>
+        <w:pStyle w:val="ListBullet"/>
+        <w:spacing w:after="80" w:line="300" w:lineRule="auto"/>
+        <w:ind w:left="540" w:hanging="271"/>
+      </w:pPr>
+      <w:r>
+        <w:rPr>
+          <w:rFonts w:ascii="Calibri" w:hAnsi="Calibri"/>
+          <w:color w:val="071827"/>
+          <w:sz w:val="21"/>
+        </w:rPr>
+        <w:t>Pujar por dos lotes distintos y comprobar la actualización WebSocket en un segundo teléfono.</w:t>
       </w:r>
     </w:p>
     <w:p>
@@ -826,7 +841,7 @@
           <w:color w:val="071827"/>
           <w:sz w:val="21"/>
         </w:rPr>
-        <w:t>Ingresar como administrador y resolver fichas sin escribir IDs.</w:t>
+        <w:t>Ingresar como administrador, leer indicadores y resolver fichas sin escribir IDs.</w:t>
       </w:r>
     </w:p>
     <w:p>
@@ -841,12 +856,175 @@
           <w:color w:val="071827"/>
           <w:sz w:val="21"/>
         </w:rPr>
-        <w:t>Cerrar con la matriz de reglas y pruebas negativas.</w:t>
+        <w:t>Cerrar con adjudicación, pago y controles negativos.</w:t>
       </w:r>
     </w:p>
     <w:p>
+      <w:pPr>
+        <w:pStyle w:val="Heading2"/>
+        <w:keepNext/>
+      </w:pPr>
       <w:r>
-        <w:br w:type="page"/>
+        <w:rPr>
+          <w:rFonts w:ascii="Calibri" w:hAnsi="Calibri"/>
+          <w:b/>
+          <w:color w:val="071827"/>
+          <w:sz w:val="26"/>
+        </w:rPr>
+        <w:t>Secuencia maestra punta a punta</w:t>
+      </w:r>
+    </w:p>
+    <w:p>
+      <w:pPr>
+        <w:spacing w:after="80" w:line="300" w:lineRule="auto"/>
+        <w:numPr>
+          <w:ilvl w:val="0"/>
+          <w:numId w:val="10"/>
+        </w:numPr>
+      </w:pPr>
+      <w:r>
+        <w:rPr>
+          <w:rFonts w:ascii="Calibri" w:hAnsi="Calibri"/>
+          <w:color w:val="071827"/>
+          <w:sz w:val="21"/>
+        </w:rPr>
+        <w:t>Acceso cliente (30123456 / 1234): comprobar Inicio, categoría, medios y avisos.</w:t>
+      </w:r>
+    </w:p>
+    <w:p>
+      <w:pPr>
+        <w:spacing w:after="80" w:line="300" w:lineRule="auto"/>
+        <w:numPr>
+          <w:ilvl w:val="0"/>
+          <w:numId w:val="10"/>
+        </w:numPr>
+      </w:pPr>
+      <w:r>
+        <w:rPr>
+          <w:rFonts w:ascii="Calibri" w:hAnsi="Calibri"/>
+          <w:color w:val="071827"/>
+          <w:sz w:val="21"/>
+        </w:rPr>
+        <w:t>Tiempo real: abrir el mismo catálogo en dos equipos y comparar los cuatro lotes.</w:t>
+      </w:r>
+    </w:p>
+    <w:p>
+      <w:pPr>
+        <w:spacing w:after="80" w:line="300" w:lineRule="auto"/>
+        <w:numPr>
+          <w:ilvl w:val="0"/>
+          <w:numId w:val="10"/>
+        </w:numPr>
+      </w:pPr>
+      <w:r>
+        <w:rPr>
+          <w:rFonts w:ascii="Calibri" w:hAnsi="Calibri"/>
+          <w:color w:val="071827"/>
+          <w:sz w:val="21"/>
+        </w:rPr>
+        <w:t>Puja: ofertar y comprobar confirmación, historial y reinicio del reloj.</w:t>
+      </w:r>
+    </w:p>
+    <w:p>
+      <w:pPr>
+        <w:spacing w:after="80" w:line="300" w:lineRule="auto"/>
+        <w:numPr>
+          <w:ilvl w:val="0"/>
+          <w:numId w:val="10"/>
+        </w:numPr>
+      </w:pPr>
+      <w:r>
+        <w:rPr>
+          <w:rFonts w:ascii="Calibri" w:hAnsi="Calibri"/>
+          <w:color w:val="071827"/>
+          <w:sz w:val="21"/>
+        </w:rPr>
+        <w:t>Consignación: enviar un bien con seis fotos y verificar el estado pendiente.</w:t>
+      </w:r>
+    </w:p>
+    <w:p>
+      <w:pPr>
+        <w:spacing w:after="80" w:line="300" w:lineRule="auto"/>
+        <w:numPr>
+          <w:ilvl w:val="0"/>
+          <w:numId w:val="10"/>
+        </w:numPr>
+      </w:pPr>
+      <w:r>
+        <w:rPr>
+          <w:rFonts w:ascii="Calibri" w:hAnsi="Calibri"/>
+          <w:color w:val="071827"/>
+          <w:sz w:val="21"/>
+        </w:rPr>
+        <w:t>Revisión admin (20000111 / 1234): leer KPIs, badges y resolver la ficha.</w:t>
+      </w:r>
+    </w:p>
+    <w:p>
+      <w:pPr>
+        <w:spacing w:after="80" w:line="300" w:lineRule="auto"/>
+        <w:numPr>
+          <w:ilvl w:val="0"/>
+          <w:numId w:val="10"/>
+        </w:numPr>
+      </w:pPr>
+      <w:r>
+        <w:rPr>
+          <w:rFonts w:ascii="Calibri" w:hAnsi="Calibri"/>
+          <w:color w:val="071827"/>
+          <w:sz w:val="21"/>
+        </w:rPr>
+        <w:t>Catálogo: asignar el producto aceptado por nombre a una subasta.</w:t>
+      </w:r>
+    </w:p>
+    <w:p>
+      <w:pPr>
+        <w:spacing w:after="80" w:line="300" w:lineRule="auto"/>
+        <w:numPr>
+          <w:ilvl w:val="0"/>
+          <w:numId w:val="10"/>
+        </w:numPr>
+      </w:pPr>
+      <w:r>
+        <w:rPr>
+          <w:rFonts w:ascii="Calibri" w:hAnsi="Calibri"/>
+          <w:color w:val="071827"/>
+          <w:sz w:val="21"/>
+        </w:rPr>
+        <w:t>Cierre: adjudicar un lote con mejor oferta y generar la compra.</w:t>
+      </w:r>
+    </w:p>
+    <w:p>
+      <w:pPr>
+        <w:spacing w:after="80" w:line="300" w:lineRule="auto"/>
+        <w:numPr>
+          <w:ilvl w:val="0"/>
+          <w:numId w:val="10"/>
+        </w:numPr>
+      </w:pPr>
+      <w:r>
+        <w:rPr>
+          <w:rFonts w:ascii="Calibri" w:hAnsi="Calibri"/>
+          <w:color w:val="071827"/>
+          <w:sz w:val="21"/>
+        </w:rPr>
+        <w:t>Pago: volver como ganador, elegir un medio compatible y acreditar.</w:t>
+      </w:r>
+    </w:p>
+    <w:p>
+      <w:pPr>
+        <w:spacing w:after="80" w:line="300" w:lineRule="auto"/>
+        <w:numPr>
+          <w:ilvl w:val="0"/>
+          <w:numId w:val="10"/>
+        </w:numPr>
+      </w:pPr>
+      <w:r>
+        <w:rPr>
+          <w:rFonts w:ascii="Calibri" w:hAnsi="Calibri"/>
+          <w:color w:val="071827"/>
+          <w:sz w:val="21"/>
+        </w:rPr>
+        <w:t>Trazabilidad: contrastar Historial, Estadísticas y Avisos.</w:t>
       </w:r>
     </w:p>
     <w:p>
@@ -1055,7 +1233,11 @@
     </w:p>
     <w:p>
       <w:pPr>
-        <w:spacing w:after="120" w:line="300" w:lineRule="auto"/>
+        <w:spacing w:after="80" w:line="300" w:lineRule="auto"/>
+        <w:numPr>
+          <w:ilvl w:val="0"/>
+          <w:numId w:val="11"/>
+        </w:numPr>
       </w:pPr>
       <w:r>
         <w:rPr>
@@ -1063,12 +1245,16 @@
           <w:color w:val="071827"/>
           <w:sz w:val="21"/>
         </w:rPr>
-        <w:t>1. Completar datos personales y avanzar al segundo paso.</w:t>
+        <w:t>Completar datos personales y avanzar al segundo paso.</w:t>
       </w:r>
     </w:p>
     <w:p>
       <w:pPr>
-        <w:spacing w:after="120" w:line="300" w:lineRule="auto"/>
+        <w:spacing w:after="80" w:line="300" w:lineRule="auto"/>
+        <w:numPr>
+          <w:ilvl w:val="0"/>
+          <w:numId w:val="11"/>
+        </w:numPr>
       </w:pPr>
       <w:r>
         <w:rPr>
@@ -1076,12 +1262,16 @@
           <w:color w:val="071827"/>
           <w:sz w:val="21"/>
         </w:rPr>
-        <w:t>2. Adjuntar ambas caras del documento y finalizar.</w:t>
+        <w:t>Adjuntar ambas caras del documento y finalizar.</w:t>
       </w:r>
     </w:p>
     <w:p>
       <w:pPr>
-        <w:spacing w:after="120" w:line="300" w:lineRule="auto"/>
+        <w:spacing w:after="80" w:line="300" w:lineRule="auto"/>
+        <w:numPr>
+          <w:ilvl w:val="0"/>
+          <w:numId w:val="11"/>
+        </w:numPr>
       </w:pPr>
       <w:r>
         <w:rPr>
@@ -1089,12 +1279,16 @@
           <w:color w:val="071827"/>
           <w:sz w:val="21"/>
         </w:rPr>
-        <w:t>3. Comprobar la pantalla de verificación pendiente.</w:t>
+        <w:t>Comprobar la pantalla de verificación pendiente.</w:t>
       </w:r>
     </w:p>
     <w:p>
       <w:pPr>
-        <w:spacing w:after="120" w:line="300" w:lineRule="auto"/>
+        <w:spacing w:after="80" w:line="300" w:lineRule="auto"/>
+        <w:numPr>
+          <w:ilvl w:val="0"/>
+          <w:numId w:val="11"/>
+        </w:numPr>
       </w:pPr>
       <w:r>
         <w:rPr>
@@ -1102,12 +1296,16 @@
           <w:color w:val="071827"/>
           <w:sz w:val="21"/>
         </w:rPr>
-        <w:t>4. Ingresar como administrador y tocar la ficha del usuario.</w:t>
+        <w:t>Ingresar como administrador y tocar la ficha del usuario.</w:t>
       </w:r>
     </w:p>
     <w:p>
       <w:pPr>
-        <w:spacing w:after="120" w:line="300" w:lineRule="auto"/>
+        <w:spacing w:after="80" w:line="300" w:lineRule="auto"/>
+        <w:numPr>
+          <w:ilvl w:val="0"/>
+          <w:numId w:val="11"/>
+        </w:numPr>
       </w:pPr>
       <w:r>
         <w:rPr>
@@ -1115,7 +1313,7 @@
           <w:color w:val="071827"/>
           <w:sz w:val="21"/>
         </w:rPr>
-        <w:t>5. Revisar identidad, contacto y documentación; aprobar y elegir categoría.</w:t>
+        <w:t>Revisar identidad, contacto y documentación; aprobar y elegir categoría.</w:t>
       </w:r>
     </w:p>
     <w:p>
@@ -1209,14 +1407,10 @@
       </w:r>
     </w:p>
     <w:p>
-      <w:r>
-        <w:br w:type="page"/>
-      </w:r>
-    </w:p>
-    <w:p>
       <w:pPr>
         <w:pStyle w:val="Heading1"/>
         <w:keepNext/>
+        <w:pageBreakBefore/>
       </w:pPr>
       <w:r>
         <w:rPr>
@@ -1404,7 +1598,11 @@
     </w:p>
     <w:p>
       <w:pPr>
-        <w:spacing w:after="120" w:line="300" w:lineRule="auto"/>
+        <w:spacing w:after="80" w:line="300" w:lineRule="auto"/>
+        <w:numPr>
+          <w:ilvl w:val="0"/>
+          <w:numId w:val="12"/>
+        </w:numPr>
       </w:pPr>
       <w:r>
         <w:rPr>
@@ -1412,12 +1610,16 @@
           <w:color w:val="071827"/>
           <w:sz w:val="21"/>
         </w:rPr>
-        <w:t>1. Abrir Medios de pago y crear una cuenta, tarjeta o cheque.</w:t>
+        <w:t>Abrir Medios de pago y crear una cuenta, tarjeta o cheque.</w:t>
       </w:r>
     </w:p>
     <w:p>
       <w:pPr>
-        <w:spacing w:after="120" w:line="300" w:lineRule="auto"/>
+        <w:spacing w:after="80" w:line="300" w:lineRule="auto"/>
+        <w:numPr>
+          <w:ilvl w:val="0"/>
+          <w:numId w:val="12"/>
+        </w:numPr>
       </w:pPr>
       <w:r>
         <w:rPr>
@@ -1425,12 +1627,16 @@
           <w:color w:val="071827"/>
           <w:sz w:val="21"/>
         </w:rPr>
-        <w:t>2. Elegir moneda y completar entidad/referencia.</w:t>
+        <w:t>Elegir moneda y completar entidad/referencia.</w:t>
       </w:r>
     </w:p>
     <w:p>
       <w:pPr>
-        <w:spacing w:after="120" w:line="300" w:lineRule="auto"/>
+        <w:spacing w:after="80" w:line="300" w:lineRule="auto"/>
+        <w:numPr>
+          <w:ilvl w:val="0"/>
+          <w:numId w:val="12"/>
+        </w:numPr>
       </w:pPr>
       <w:r>
         <w:rPr>
@@ -1438,12 +1644,16 @@
           <w:color w:val="071827"/>
           <w:sz w:val="21"/>
         </w:rPr>
-        <w:t>3. Ingresar como administrador y tocar la ficha pendiente.</w:t>
+        <w:t>Ingresar como administrador y tocar la ficha pendiente.</w:t>
       </w:r>
     </w:p>
     <w:p>
       <w:pPr>
-        <w:spacing w:after="120" w:line="300" w:lineRule="auto"/>
+        <w:spacing w:after="80" w:line="300" w:lineRule="auto"/>
+        <w:numPr>
+          <w:ilvl w:val="0"/>
+          <w:numId w:val="12"/>
+        </w:numPr>
       </w:pPr>
       <w:r>
         <w:rPr>
@@ -1451,12 +1661,16 @@
           <w:color w:val="071827"/>
           <w:sz w:val="21"/>
         </w:rPr>
-        <w:t>4. Revisar titular, entidad, referencia, moneda y compatibilidad; aprobar en un toque.</w:t>
+        <w:t>Revisar titular, entidad, referencia, moneda y compatibilidad; aprobar en un toque.</w:t>
       </w:r>
     </w:p>
     <w:p>
       <w:pPr>
-        <w:spacing w:after="120" w:line="300" w:lineRule="auto"/>
+        <w:spacing w:after="80" w:line="300" w:lineRule="auto"/>
+        <w:numPr>
+          <w:ilvl w:val="0"/>
+          <w:numId w:val="12"/>
+        </w:numPr>
       </w:pPr>
       <w:r>
         <w:rPr>
@@ -1464,7 +1678,7 @@
           <w:color w:val="071827"/>
           <w:sz w:val="21"/>
         </w:rPr>
-        <w:t>5. Volver como cliente y comprobar el estado verificado.</w:t>
+        <w:t>Volver como cliente y comprobar el estado verificado.</w:t>
       </w:r>
     </w:p>
     <w:p>
@@ -1573,14 +1787,10 @@
       </w:r>
     </w:p>
     <w:p>
-      <w:r>
-        <w:br w:type="page"/>
-      </w:r>
-    </w:p>
-    <w:p>
       <w:pPr>
         <w:pStyle w:val="Heading1"/>
         <w:keepNext/>
+        <w:pageBreakBefore/>
       </w:pPr>
       <w:r>
         <w:rPr>
@@ -1715,7 +1925,7 @@
                 <w:color w:val="071827"/>
                 <w:sz w:val="17"/>
               </w:rPr>
-              <w:t>Ofertar por más de un lote y visualizar cada participación.</w:t>
+              <w:t>Ofertar por más de un lote y visualizar cada participación con su propio reloj.</w:t>
             </w:r>
           </w:p>
         </w:tc>
@@ -1798,7 +2008,11 @@
     </w:p>
     <w:p>
       <w:pPr>
-        <w:spacing w:after="120" w:line="300" w:lineRule="auto"/>
+        <w:spacing w:after="80" w:line="300" w:lineRule="auto"/>
+        <w:numPr>
+          <w:ilvl w:val="0"/>
+          <w:numId w:val="13"/>
+        </w:numPr>
       </w:pPr>
       <w:r>
         <w:rPr>
@@ -1806,12 +2020,16 @@
           <w:color w:val="071827"/>
           <w:sz w:val="21"/>
         </w:rPr>
-        <w:t>1. Abrir una subasta disponible.</w:t>
+        <w:t>Abrir Fotografía &amp; Tecnología o cualquier subasta disponible.</w:t>
       </w:r>
     </w:p>
     <w:p>
       <w:pPr>
-        <w:spacing w:after="120" w:line="300" w:lineRule="auto"/>
+        <w:spacing w:after="80" w:line="300" w:lineRule="auto"/>
+        <w:numPr>
+          <w:ilvl w:val="0"/>
+          <w:numId w:val="13"/>
+        </w:numPr>
       </w:pPr>
       <w:r>
         <w:rPr>
@@ -1819,12 +2037,16 @@
           <w:color w:val="071827"/>
           <w:sz w:val="21"/>
         </w:rPr>
-        <w:t>2. Recorrer todos los lotes abiertos; cada uno debe mostrar PUJAR POR ESTE LOTE.</w:t>
+        <w:t>Recorrer todos los lotes abiertos; cada tarjeta debe mostrar su reloj y las últimas tres ofertas.</w:t>
       </w:r>
     </w:p>
     <w:p>
       <w:pPr>
-        <w:spacing w:after="120" w:line="300" w:lineRule="auto"/>
+        <w:spacing w:after="80" w:line="300" w:lineRule="auto"/>
+        <w:numPr>
+          <w:ilvl w:val="0"/>
+          <w:numId w:val="13"/>
+        </w:numPr>
       </w:pPr>
       <w:r>
         <w:rPr>
@@ -1832,12 +2054,16 @@
           <w:color w:val="071827"/>
           <w:sz w:val="21"/>
         </w:rPr>
-        <w:t>3. Pujar por un primer lote y esperar confirmación del servidor.</w:t>
+        <w:t>Anotar la duración configurada y pujar por un primer lote.</w:t>
       </w:r>
     </w:p>
     <w:p>
       <w:pPr>
-        <w:spacing w:after="120" w:line="300" w:lineRule="auto"/>
+        <w:spacing w:after="80" w:line="300" w:lineRule="auto"/>
+        <w:numPr>
+          <w:ilvl w:val="0"/>
+          <w:numId w:val="13"/>
+        </w:numPr>
       </w:pPr>
       <w:r>
         <w:rPr>
@@ -1845,12 +2071,16 @@
           <w:color w:val="071827"/>
           <w:sz w:val="21"/>
         </w:rPr>
-        <w:t>4. Sin salir de la subasta, pujar por otro lote abierto del mismo catálogo.</w:t>
+        <w:t>Confirmar que sólo ese reloj vuelve a la duración completa y que la oferta aparece primera en el mini historial.</w:t>
       </w:r>
     </w:p>
     <w:p>
       <w:pPr>
-        <w:spacing w:after="120" w:line="300" w:lineRule="auto"/>
+        <w:spacing w:after="80" w:line="300" w:lineRule="auto"/>
+        <w:numPr>
+          <w:ilvl w:val="0"/>
+          <w:numId w:val="13"/>
+        </w:numPr>
       </w:pPr>
       <w:r>
         <w:rPr>
@@ -1858,12 +2088,16 @@
           <w:color w:val="071827"/>
           <w:sz w:val="21"/>
         </w:rPr>
-        <w:t>5. Comprobar que mejores ofertas y liderazgos cambian solos en dos teléfonos.</w:t>
+        <w:t>Sin salir de la subasta, pujar por otro lote abierto del mismo catálogo.</w:t>
       </w:r>
     </w:p>
     <w:p>
       <w:pPr>
-        <w:spacing w:after="120" w:line="300" w:lineRule="auto"/>
+        <w:spacing w:after="80" w:line="300" w:lineRule="auto"/>
+        <w:numPr>
+          <w:ilvl w:val="0"/>
+          <w:numId w:val="13"/>
+        </w:numPr>
       </w:pPr>
       <w:r>
         <w:rPr>
@@ -1871,12 +2105,16 @@
           <w:color w:val="071827"/>
           <w:sz w:val="21"/>
         </w:rPr>
-        <w:t>6. Abrir Historial y verificar dos fichas independientes actualizadas automáticamente.</w:t>
+        <w:t>Comprobar que mejores ofertas, relojes y liderazgos cambian solos en dos teléfonos.</w:t>
       </w:r>
     </w:p>
     <w:p>
       <w:pPr>
-        <w:spacing w:after="120" w:line="300" w:lineRule="auto"/>
+        <w:spacing w:after="80" w:line="300" w:lineRule="auto"/>
+        <w:numPr>
+          <w:ilvl w:val="0"/>
+          <w:numId w:val="13"/>
+        </w:numPr>
       </w:pPr>
       <w:r>
         <w:rPr>
@@ -1884,7 +2122,24 @@
           <w:color w:val="071827"/>
           <w:sz w:val="21"/>
         </w:rPr>
-        <w:t>7. Tocar cada ficha para volver a su subasta.</w:t>
+        <w:t>Abrir Historial y verificar dos fichas independientes actualizadas automáticamente.</w:t>
+      </w:r>
+    </w:p>
+    <w:p>
+      <w:pPr>
+        <w:spacing w:after="80" w:line="300" w:lineRule="auto"/>
+        <w:numPr>
+          <w:ilvl w:val="0"/>
+          <w:numId w:val="13"/>
+        </w:numPr>
+      </w:pPr>
+      <w:r>
+        <w:rPr>
+          <w:rFonts w:ascii="Calibri" w:hAnsi="Calibri"/>
+          <w:color w:val="071827"/>
+          <w:sz w:val="21"/>
+        </w:rPr>
+        <w:t>Tocar cada ficha para volver a su subasta.</w:t>
       </w:r>
     </w:p>
     <w:p>
@@ -1929,7 +2184,7 @@
           <w:color w:val="071827"/>
           <w:sz w:val="21"/>
         </w:rPr>
-        <w:t>Cada lote conserva oferta propia, mejor actual y estado GANADO/LIDERANDO/SUPERADA.</w:t>
+        <w:t>Cada lote conserva contador, historial, oferta propia, mejor actual y estado GANADO/LIDERANDO/SUPERADA.</w:t>
       </w:r>
     </w:p>
     <w:p>
@@ -1989,21 +2244,6 @@
           <w:color w:val="071827"/>
           <w:sz w:val="21"/>
         </w:rPr>
-        <w:t>Abrir dos teléfonos en la misma subasta: ambos deben recibir el mismo snapshot por WebSocket.</w:t>
-      </w:r>
-    </w:p>
-    <w:p>
-      <w:pPr>
-        <w:pStyle w:val="ListBullet"/>
-        <w:spacing w:after="80" w:line="300" w:lineRule="auto"/>
-        <w:ind w:left="540" w:hanging="271"/>
-      </w:pPr>
-      <w:r>
-        <w:rPr>
-          <w:rFonts w:ascii="Calibri" w:hAnsi="Calibri"/>
-          <w:color w:val="071827"/>
-          <w:sz w:val="21"/>
-        </w:rPr>
         <w:t>Probar menos de mejor oferta + 1% de base: rechazo.</w:t>
       </w:r>
     </w:p>
@@ -2034,33 +2274,14 @@
           <w:color w:val="071827"/>
           <w:sz w:val="21"/>
         </w:rPr>
-        <w:t>Entrar a otra subasta sin haber ofertado: debe permitir confirmar el cambio.</w:t>
+        <w:t>Cambiar de subasta debe permitirse antes de ofertar y bloquearse, con explicación, después de una puja.</w:t>
       </w:r>
     </w:p>
     <w:p>
       <w:pPr>
-        <w:pStyle w:val="ListBullet"/>
-        <w:spacing w:after="80" w:line="300" w:lineRule="auto"/>
-        <w:ind w:left="540" w:hanging="271"/>
-      </w:pPr>
-      <w:r>
-        <w:rPr>
-          <w:rFonts w:ascii="Calibri" w:hAnsi="Calibri"/>
-          <w:color w:val="071827"/>
-          <w:sz w:val="21"/>
-        </w:rPr>
-        <w:t>Intentar cambiar luego de pujar: debe conservar el vínculo y explicar el motivo.</w:t>
-      </w:r>
-    </w:p>
-    <w:p>
-      <w:r>
-        <w:br w:type="page"/>
-      </w:r>
-    </w:p>
-    <w:p>
-      <w:pPr>
         <w:pStyle w:val="Heading1"/>
         <w:keepNext/>
+        <w:pageBreakBefore/>
       </w:pPr>
       <w:r>
         <w:rPr>
@@ -2263,7 +2484,11 @@
     </w:p>
     <w:p>
       <w:pPr>
-        <w:spacing w:after="120" w:line="300" w:lineRule="auto"/>
+        <w:spacing w:after="80" w:line="300" w:lineRule="auto"/>
+        <w:numPr>
+          <w:ilvl w:val="0"/>
+          <w:numId w:val="14"/>
+        </w:numPr>
       </w:pPr>
       <w:r>
         <w:rPr>
@@ -2271,12 +2496,16 @@
           <w:color w:val="071827"/>
           <w:sz w:val="21"/>
         </w:rPr>
-        <w:t>1. Desde el panel interno elegir Cerrar lote.</w:t>
+        <w:t>Desde el panel interno elegir Cerrar lote.</w:t>
       </w:r>
     </w:p>
     <w:p>
       <w:pPr>
-        <w:spacing w:after="120" w:line="300" w:lineRule="auto"/>
+        <w:spacing w:after="80" w:line="300" w:lineRule="auto"/>
+        <w:numPr>
+          <w:ilvl w:val="0"/>
+          <w:numId w:val="14"/>
+        </w:numPr>
       </w:pPr>
       <w:r>
         <w:rPr>
@@ -2284,12 +2513,16 @@
           <w:color w:val="071827"/>
           <w:sz w:val="21"/>
         </w:rPr>
-        <w:t>2. Seleccionar la ficha que muestra artículo, pujas y mejor oferta.</w:t>
+        <w:t>Seleccionar la ficha que muestra artículo, pujas y mejor oferta.</w:t>
       </w:r>
     </w:p>
     <w:p>
       <w:pPr>
-        <w:spacing w:after="120" w:line="300" w:lineRule="auto"/>
+        <w:spacing w:after="80" w:line="300" w:lineRule="auto"/>
+        <w:numPr>
+          <w:ilvl w:val="0"/>
+          <w:numId w:val="14"/>
+        </w:numPr>
       </w:pPr>
       <w:r>
         <w:rPr>
@@ -2297,12 +2530,16 @@
           <w:color w:val="071827"/>
           <w:sz w:val="21"/>
         </w:rPr>
-        <w:t>3. Confirmar adjudicación.</w:t>
+        <w:t>Confirmar adjudicación.</w:t>
       </w:r>
     </w:p>
     <w:p>
       <w:pPr>
-        <w:spacing w:after="120" w:line="300" w:lineRule="auto"/>
+        <w:spacing w:after="80" w:line="300" w:lineRule="auto"/>
+        <w:numPr>
+          <w:ilvl w:val="0"/>
+          <w:numId w:val="14"/>
+        </w:numPr>
       </w:pPr>
       <w:r>
         <w:rPr>
@@ -2310,12 +2547,16 @@
           <w:color w:val="071827"/>
           <w:sz w:val="21"/>
         </w:rPr>
-        <w:t>4. Ingresar como ganador y abrir Compras.</w:t>
+        <w:t>Ingresar como ganador y abrir Compras.</w:t>
       </w:r>
     </w:p>
     <w:p>
       <w:pPr>
-        <w:spacing w:after="120" w:line="300" w:lineRule="auto"/>
+        <w:spacing w:after="80" w:line="300" w:lineRule="auto"/>
+        <w:numPr>
+          <w:ilvl w:val="0"/>
+          <w:numId w:val="14"/>
+        </w:numPr>
       </w:pPr>
       <w:r>
         <w:rPr>
@@ -2323,12 +2564,16 @@
           <w:color w:val="071827"/>
           <w:sz w:val="21"/>
         </w:rPr>
-        <w:t>5. Tocar ELEGIR MEDIO Y PAGAR.</w:t>
+        <w:t>Tocar ELEGIR MEDIO Y PAGAR.</w:t>
       </w:r>
     </w:p>
     <w:p>
       <w:pPr>
-        <w:spacing w:after="120" w:line="300" w:lineRule="auto"/>
+        <w:spacing w:after="80" w:line="300" w:lineRule="auto"/>
+        <w:numPr>
+          <w:ilvl w:val="0"/>
+          <w:numId w:val="14"/>
+        </w:numPr>
       </w:pPr>
       <w:r>
         <w:rPr>
@@ -2336,7 +2581,7 @@
           <w:color w:val="071827"/>
           <w:sz w:val="21"/>
         </w:rPr>
-        <w:t>6. Seleccionar uno de los medios compatibles y confirmar.</w:t>
+        <w:t>Seleccionar uno de los medios compatibles y confirmar.</w:t>
       </w:r>
     </w:p>
     <w:p>
@@ -2445,14 +2690,10 @@
       </w:r>
     </w:p>
     <w:p>
-      <w:r>
-        <w:br w:type="page"/>
-      </w:r>
-    </w:p>
-    <w:p>
       <w:pPr>
         <w:pStyle w:val="Heading1"/>
         <w:keepNext/>
+        <w:pageBreakBefore/>
       </w:pPr>
       <w:r>
         <w:rPr>
@@ -2670,7 +2911,11 @@
     </w:p>
     <w:p>
       <w:pPr>
-        <w:spacing w:after="120" w:line="300" w:lineRule="auto"/>
+        <w:spacing w:after="80" w:line="300" w:lineRule="auto"/>
+        <w:numPr>
+          <w:ilvl w:val="0"/>
+          <w:numId w:val="15"/>
+        </w:numPr>
       </w:pPr>
       <w:r>
         <w:rPr>
@@ -2678,12 +2923,16 @@
           <w:color w:val="071827"/>
           <w:sz w:val="21"/>
         </w:rPr>
-        <w:t>1. Abrir Consignar y completar toda la ficha.</w:t>
+        <w:t>Abrir Consignar y completar toda la ficha.</w:t>
       </w:r>
     </w:p>
     <w:p>
       <w:pPr>
-        <w:spacing w:after="120" w:line="300" w:lineRule="auto"/>
+        <w:spacing w:after="80" w:line="300" w:lineRule="auto"/>
+        <w:numPr>
+          <w:ilvl w:val="0"/>
+          <w:numId w:val="15"/>
+        </w:numPr>
       </w:pPr>
       <w:r>
         <w:rPr>
@@ -2691,12 +2940,16 @@
           <w:color w:val="071827"/>
           <w:sz w:val="21"/>
         </w:rPr>
-        <w:t>2. Adjuntar seis o más fotos sin deformación.</w:t>
+        <w:t>Adjuntar seis o más fotos sin deformación.</w:t>
       </w:r>
     </w:p>
     <w:p>
       <w:pPr>
-        <w:spacing w:after="120" w:line="300" w:lineRule="auto"/>
+        <w:spacing w:after="80" w:line="300" w:lineRule="auto"/>
+        <w:numPr>
+          <w:ilvl w:val="0"/>
+          <w:numId w:val="15"/>
+        </w:numPr>
       </w:pPr>
       <w:r>
         <w:rPr>
@@ -2704,12 +2957,16 @@
           <w:color w:val="071827"/>
           <w:sz w:val="21"/>
         </w:rPr>
-        <w:t>3. Enviar a inspección.</w:t>
+        <w:t>Enviar a inspección.</w:t>
       </w:r>
     </w:p>
     <w:p>
       <w:pPr>
-        <w:spacing w:after="120" w:line="300" w:lineRule="auto"/>
+        <w:spacing w:after="80" w:line="300" w:lineRule="auto"/>
+        <w:numPr>
+          <w:ilvl w:val="0"/>
+          <w:numId w:val="15"/>
+        </w:numPr>
       </w:pPr>
       <w:r>
         <w:rPr>
@@ -2717,12 +2974,16 @@
           <w:color w:val="071827"/>
           <w:sz w:val="21"/>
         </w:rPr>
-        <w:t>4. Como administrador tocar la ficha, revisar toda la información y enviar precio base/comisión.</w:t>
+        <w:t>Como administrador tocar la ficha, revisar toda la información y enviar precio base/comisión.</w:t>
       </w:r>
     </w:p>
     <w:p>
       <w:pPr>
-        <w:spacing w:after="120" w:line="300" w:lineRule="auto"/>
+        <w:spacing w:after="80" w:line="300" w:lineRule="auto"/>
+        <w:numPr>
+          <w:ilvl w:val="0"/>
+          <w:numId w:val="15"/>
+        </w:numPr>
       </w:pPr>
       <w:r>
         <w:rPr>
@@ -2730,12 +2991,16 @@
           <w:color w:val="071827"/>
           <w:sz w:val="21"/>
         </w:rPr>
-        <w:t>5. Como cliente aceptar la propuesta.</w:t>
+        <w:t>Como cliente aceptar la propuesta.</w:t>
       </w:r>
     </w:p>
     <w:p>
       <w:pPr>
-        <w:spacing w:after="120" w:line="300" w:lineRule="auto"/>
+        <w:spacing w:after="80" w:line="300" w:lineRule="auto"/>
+        <w:numPr>
+          <w:ilvl w:val="0"/>
+          <w:numId w:val="15"/>
+        </w:numPr>
       </w:pPr>
       <w:r>
         <w:rPr>
@@ -2743,7 +3008,7 @@
           <w:color w:val="071827"/>
           <w:sz w:val="21"/>
         </w:rPr>
-        <w:t>6. Como administrador elegir Asignar a subasta, seleccionar producto y destino por nombre y confirmar.</w:t>
+        <w:t>Como administrador elegir Asignar a subasta, seleccionar producto y destino por nombre y confirmar.</w:t>
       </w:r>
     </w:p>
     <w:p>
@@ -2852,14 +3117,10 @@
       </w:r>
     </w:p>
     <w:p>
-      <w:r>
-        <w:br w:type="page"/>
-      </w:r>
-    </w:p>
-    <w:p>
       <w:pPr>
         <w:pStyle w:val="Heading1"/>
         <w:keepNext/>
+        <w:pageBreakBefore/>
       </w:pPr>
       <w:r>
         <w:rPr>
@@ -3047,7 +3308,11 @@
     </w:p>
     <w:p>
       <w:pPr>
-        <w:spacing w:after="120" w:line="300" w:lineRule="auto"/>
+        <w:spacing w:after="80" w:line="300" w:lineRule="auto"/>
+        <w:numPr>
+          <w:ilvl w:val="0"/>
+          <w:numId w:val="16"/>
+        </w:numPr>
       </w:pPr>
       <w:r>
         <w:rPr>
@@ -3055,12 +3320,16 @@
           <w:color w:val="071827"/>
           <w:sz w:val="21"/>
         </w:rPr>
-        <w:t>1. Actualizar pendientes.</w:t>
+        <w:t>Leer el bloque ejecutivo: clientes habilitados, subastas activas, lotes y pagos pendientes.</w:t>
       </w:r>
     </w:p>
     <w:p>
       <w:pPr>
-        <w:spacing w:after="120" w:line="300" w:lineRule="auto"/>
+        <w:spacing w:after="80" w:line="300" w:lineRule="auto"/>
+        <w:numPr>
+          <w:ilvl w:val="0"/>
+          <w:numId w:val="16"/>
+        </w:numPr>
       </w:pPr>
       <w:r>
         <w:rPr>
@@ -3068,12 +3337,16 @@
           <w:color w:val="071827"/>
           <w:sz w:val="21"/>
         </w:rPr>
-        <w:t>2. Tocar cada usuario, medio o consignación para ver su ficha.</w:t>
+        <w:t>Comprobar los badges numéricos de cada acción.</w:t>
       </w:r>
     </w:p>
     <w:p>
       <w:pPr>
-        <w:spacing w:after="120" w:line="300" w:lineRule="auto"/>
+        <w:spacing w:after="80" w:line="300" w:lineRule="auto"/>
+        <w:numPr>
+          <w:ilvl w:val="0"/>
+          <w:numId w:val="16"/>
+        </w:numPr>
       </w:pPr>
       <w:r>
         <w:rPr>
@@ -3081,12 +3354,16 @@
           <w:color w:val="071827"/>
           <w:sz w:val="21"/>
         </w:rPr>
-        <w:t>3. Aprobar o rechazar desde la ficha.</w:t>
+        <w:t>Tocar Revisar usuarios, Medios de pago o Consignaciones; la pantalla debe desplazarse directamente a la cola correspondiente.</w:t>
       </w:r>
     </w:p>
     <w:p>
       <w:pPr>
-        <w:spacing w:after="120" w:line="300" w:lineRule="auto"/>
+        <w:spacing w:after="80" w:line="300" w:lineRule="auto"/>
+        <w:numPr>
+          <w:ilvl w:val="0"/>
+          <w:numId w:val="16"/>
+        </w:numPr>
       </w:pPr>
       <w:r>
         <w:rPr>
@@ -3094,12 +3371,16 @@
           <w:color w:val="071827"/>
           <w:sz w:val="21"/>
         </w:rPr>
-        <w:t>4. Gestionar altas, modificaciones, cancelaciones y bajas de subastas.</w:t>
+        <w:t>Tocar una ficha para ver toda la información y aprobar o rechazar.</w:t>
       </w:r>
     </w:p>
     <w:p>
       <w:pPr>
-        <w:spacing w:after="120" w:line="300" w:lineRule="auto"/>
+        <w:spacing w:after="80" w:line="300" w:lineRule="auto"/>
+        <w:numPr>
+          <w:ilvl w:val="0"/>
+          <w:numId w:val="16"/>
+        </w:numPr>
       </w:pPr>
       <w:r>
         <w:rPr>
@@ -3107,12 +3388,16 @@
           <w:color w:val="071827"/>
           <w:sz w:val="21"/>
         </w:rPr>
-        <w:t>5. Asignar productos mediante selectores descriptivos.</w:t>
+        <w:t>Gestionar altas, modificaciones, cancelaciones y bajas de subastas.</w:t>
       </w:r>
     </w:p>
     <w:p>
       <w:pPr>
-        <w:spacing w:after="120" w:line="300" w:lineRule="auto"/>
+        <w:spacing w:after="80" w:line="300" w:lineRule="auto"/>
+        <w:numPr>
+          <w:ilvl w:val="0"/>
+          <w:numId w:val="16"/>
+        </w:numPr>
       </w:pPr>
       <w:r>
         <w:rPr>
@@ -3120,12 +3405,16 @@
           <w:color w:val="071827"/>
           <w:sz w:val="21"/>
         </w:rPr>
-        <w:t>6. Cerrar lotes desde la lista de lotes abiertos.</w:t>
+        <w:t>Asignar productos mediante selectores descriptivos.</w:t>
       </w:r>
     </w:p>
     <w:p>
       <w:pPr>
-        <w:spacing w:after="120" w:line="300" w:lineRule="auto"/>
+        <w:spacing w:after="80" w:line="300" w:lineRule="auto"/>
+        <w:numPr>
+          <w:ilvl w:val="0"/>
+          <w:numId w:val="16"/>
+        </w:numPr>
       </w:pPr>
       <w:r>
         <w:rPr>
@@ -3133,7 +3422,24 @@
           <w:color w:val="071827"/>
           <w:sz w:val="21"/>
         </w:rPr>
-        <w:t>7. Aplicar multa desde la lista de impagos vencidos; confirmar el 10% calculado.</w:t>
+        <w:t>Cerrar lotes desde la lista de lotes abiertos.</w:t>
+      </w:r>
+    </w:p>
+    <w:p>
+      <w:pPr>
+        <w:spacing w:after="80" w:line="300" w:lineRule="auto"/>
+        <w:numPr>
+          <w:ilvl w:val="0"/>
+          <w:numId w:val="16"/>
+        </w:numPr>
+      </w:pPr>
+      <w:r>
+        <w:rPr>
+          <w:rFonts w:ascii="Calibri" w:hAnsi="Calibri"/>
+          <w:color w:val="071827"/>
+          <w:sz w:val="21"/>
+        </w:rPr>
+        <w:t>Aplicar multa desde la lista de impagos vencidos; confirmar el 10% calculado.</w:t>
       </w:r>
     </w:p>
     <w:p>
@@ -3178,6 +3484,21 @@
           <w:color w:val="071827"/>
           <w:sz w:val="21"/>
         </w:rPr>
+        <w:t>Los indicadores y colas se refrescan al volver al panel.</w:t>
+      </w:r>
+    </w:p>
+    <w:p>
+      <w:pPr>
+        <w:pStyle w:val="ListBullet"/>
+        <w:spacing w:after="80" w:line="300" w:lineRule="auto"/>
+        <w:ind w:left="540" w:hanging="271"/>
+      </w:pPr>
+      <w:r>
+        <w:rPr>
+          <w:rFonts w:ascii="Calibri" w:hAnsi="Calibri"/>
+          <w:color w:val="071827"/>
+          <w:sz w:val="21"/>
+        </w:rPr>
         <w:t>Cada decisión muestra confirmación estándar y actualiza pendientes.</w:t>
       </w:r>
     </w:p>
@@ -3227,14 +3548,10 @@
       </w:r>
     </w:p>
     <w:p>
-      <w:r>
-        <w:br w:type="page"/>
-      </w:r>
-    </w:p>
-    <w:p>
       <w:pPr>
         <w:pStyle w:val="Heading1"/>
         <w:keepNext/>
+        <w:pageBreakBefore/>
       </w:pPr>
       <w:r>
         <w:rPr>
@@ -3422,7 +3739,11 @@
     </w:p>
     <w:p>
       <w:pPr>
-        <w:spacing w:after="120" w:line="300" w:lineRule="auto"/>
+        <w:spacing w:after="80" w:line="300" w:lineRule="auto"/>
+        <w:numPr>
+          <w:ilvl w:val="0"/>
+          <w:numId w:val="17"/>
+        </w:numPr>
       </w:pPr>
       <w:r>
         <w:rPr>
@@ -3430,12 +3751,16 @@
           <w:color w:val="071827"/>
           <w:sz w:val="21"/>
         </w:rPr>
-        <w:t>1. Abrir Avisos y revisar los eventos ordenados.</w:t>
+        <w:t>Abrir Avisos y revisar los eventos ordenados.</w:t>
       </w:r>
     </w:p>
     <w:p>
       <w:pPr>
-        <w:spacing w:after="120" w:line="300" w:lineRule="auto"/>
+        <w:spacing w:after="80" w:line="300" w:lineRule="auto"/>
+        <w:numPr>
+          <w:ilvl w:val="0"/>
+          <w:numId w:val="17"/>
+        </w:numPr>
       </w:pPr>
       <w:r>
         <w:rPr>
@@ -3443,12 +3768,16 @@
           <w:color w:val="071827"/>
           <w:sz w:val="21"/>
         </w:rPr>
-        <w:t>2. Marcar un aviso como leído.</w:t>
+        <w:t>Marcar un aviso como leído.</w:t>
       </w:r>
     </w:p>
     <w:p>
       <w:pPr>
-        <w:spacing w:after="120" w:line="300" w:lineRule="auto"/>
+        <w:spacing w:after="80" w:line="300" w:lineRule="auto"/>
+        <w:numPr>
+          <w:ilvl w:val="0"/>
+          <w:numId w:val="17"/>
+        </w:numPr>
       </w:pPr>
       <w:r>
         <w:rPr>
@@ -3456,12 +3785,16 @@
           <w:color w:val="071827"/>
           <w:sz w:val="21"/>
         </w:rPr>
-        <w:t>3. Abrir Estadísticas.</w:t>
+        <w:t>Abrir Estadísticas.</w:t>
       </w:r>
     </w:p>
     <w:p>
       <w:pPr>
-        <w:spacing w:after="120" w:line="300" w:lineRule="auto"/>
+        <w:spacing w:after="80" w:line="300" w:lineRule="auto"/>
+        <w:numPr>
+          <w:ilvl w:val="0"/>
+          <w:numId w:val="17"/>
+        </w:numPr>
       </w:pPr>
       <w:r>
         <w:rPr>
@@ -3469,12 +3802,16 @@
           <w:color w:val="071827"/>
           <w:sz w:val="21"/>
         </w:rPr>
-        <w:t>4. Comparar subastas, lotes, pujas, ganados, consignados y avisos.</w:t>
+        <w:t>Comparar subastas, lotes, pujas, ganados, consignados y avisos.</w:t>
       </w:r>
     </w:p>
     <w:p>
       <w:pPr>
-        <w:spacing w:after="120" w:line="300" w:lineRule="auto"/>
+        <w:spacing w:after="80" w:line="300" w:lineRule="auto"/>
+        <w:numPr>
+          <w:ilvl w:val="0"/>
+          <w:numId w:val="17"/>
+        </w:numPr>
       </w:pPr>
       <w:r>
         <w:rPr>
@@ -3482,7 +3819,7 @@
           <w:color w:val="071827"/>
           <w:sz w:val="21"/>
         </w:rPr>
-        <w:t>5. Revisar barras por categoría y actividad reciente.</w:t>
+        <w:t>Revisar barras por categoría y actividad reciente.</w:t>
       </w:r>
     </w:p>
     <w:p>
@@ -5376,7 +5713,7 @@
                 <w:color w:val="071827"/>
                 <w:sz w:val="17"/>
               </w:rPr>
-              <w:t>Estadísticas</w:t>
+              <w:t>Panel ejecutivo</w:t>
             </w:r>
           </w:p>
         </w:tc>
@@ -5428,7 +5765,7 @@
                 <w:color w:val="071827"/>
                 <w:sz w:val="17"/>
               </w:rPr>
-              <w:t>Participaciones, pujas, categorías, ganados e importes.</w:t>
+              <w:t>KPIs operativos, badges de trabajo e iconografía específica por acción.</w:t>
             </w:r>
           </w:p>
         </w:tc>
@@ -5458,6 +5795,87 @@
                 <w:color w:val="071827"/>
                 <w:sz w:val="17"/>
               </w:rPr>
+              <w:t>Estadísticas</w:t>
+            </w:r>
+          </w:p>
+        </w:tc>
+        <w:tc>
+          <w:tcPr>
+            <w:tcW w:type="dxa" w:w="1500"/>
+            <w:vAlign w:val="center"/>
+            <w:tcMar>
+              <w:top w:w="80" w:type="dxa"/>
+              <w:bottom w:w="80" w:type="dxa"/>
+              <w:start w:w="120" w:type="dxa"/>
+              <w:end w:w="120" w:type="dxa"/>
+            </w:tcMar>
+          </w:tcPr>
+          <w:p>
+            <w:pPr>
+              <w:spacing w:after="0" w:line="240" w:lineRule="auto"/>
+            </w:pPr>
+            <w:r>
+              <w:rPr>
+                <w:rFonts w:ascii="Calibri" w:hAnsi="Calibri"/>
+                <w:color w:val="071827"/>
+                <w:sz w:val="17"/>
+              </w:rPr>
+              <w:t>Cumple</w:t>
+            </w:r>
+          </w:p>
+        </w:tc>
+        <w:tc>
+          <w:tcPr>
+            <w:tcW w:type="dxa" w:w="5960"/>
+            <w:vAlign w:val="center"/>
+            <w:tcMar>
+              <w:top w:w="80" w:type="dxa"/>
+              <w:bottom w:w="80" w:type="dxa"/>
+              <w:start w:w="120" w:type="dxa"/>
+              <w:end w:w="120" w:type="dxa"/>
+            </w:tcMar>
+          </w:tcPr>
+          <w:p>
+            <w:pPr>
+              <w:spacing w:after="0" w:line="240" w:lineRule="auto"/>
+            </w:pPr>
+            <w:r>
+              <w:rPr>
+                <w:rFonts w:ascii="Calibri" w:hAnsi="Calibri"/>
+                <w:color w:val="071827"/>
+                <w:sz w:val="17"/>
+              </w:rPr>
+              <w:t>Participaciones, pujas, categorías, ganados e importes.</w:t>
+            </w:r>
+          </w:p>
+        </w:tc>
+      </w:tr>
+      <w:tr>
+        <w:trPr>
+          <w:cantSplit/>
+        </w:trPr>
+        <w:tc>
+          <w:tcPr>
+            <w:tcW w:type="dxa" w:w="1900"/>
+            <w:shd w:fill="F8FAFC"/>
+            <w:vAlign w:val="center"/>
+            <w:tcMar>
+              <w:top w:w="80" w:type="dxa"/>
+              <w:bottom w:w="80" w:type="dxa"/>
+              <w:start w:w="120" w:type="dxa"/>
+              <w:end w:w="120" w:type="dxa"/>
+            </w:tcMar>
+          </w:tcPr>
+          <w:p>
+            <w:pPr>
+              <w:spacing w:after="0" w:line="240" w:lineRule="auto"/>
+            </w:pPr>
+            <w:r>
+              <w:rPr>
+                <w:rFonts w:ascii="Calibri" w:hAnsi="Calibri"/>
+                <w:color w:val="071827"/>
+                <w:sz w:val="17"/>
+              </w:rPr>
               <w:t>Video</w:t>
             </w:r>
           </w:p>
@@ -5465,6 +5883,7 @@
         <w:tc>
           <w:tcPr>
             <w:tcW w:type="dxa" w:w="1500"/>
+            <w:shd w:fill="F8FAFC"/>
             <w:vAlign w:val="center"/>
             <w:tcMar>
               <w:top w:w="80" w:type="dxa"/>
@@ -5490,6 +5909,7 @@
         <w:tc>
           <w:tcPr>
             <w:tcW w:type="dxa" w:w="5960"/>
+            <w:shd w:fill="F8FAFC"/>
             <w:vAlign w:val="center"/>
             <w:tcMar>
               <w:top w:w="80" w:type="dxa"/>
@@ -5520,7 +5940,6 @@
         <w:tc>
           <w:tcPr>
             <w:tcW w:type="dxa" w:w="1900"/>
-            <w:shd w:fill="F8FAFC"/>
             <w:vAlign w:val="center"/>
             <w:tcMar>
               <w:top w:w="80" w:type="dxa"/>
@@ -5546,7 +5965,6 @@
         <w:tc>
           <w:tcPr>
             <w:tcW w:type="dxa" w:w="1500"/>
-            <w:shd w:fill="F8FAFC"/>
             <w:vAlign w:val="center"/>
             <w:tcMar>
               <w:top w:w="80" w:type="dxa"/>
@@ -5572,7 +5990,6 @@
         <w:tc>
           <w:tcPr>
             <w:tcW w:type="dxa" w:w="5960"/>
-            <w:shd w:fill="F8FAFC"/>
             <w:vAlign w:val="center"/>
             <w:tcMar>
               <w:top w:w="80" w:type="dxa"/>
@@ -5673,6 +6090,21 @@
           <w:sz w:val="21"/>
         </w:rPr>
         <w:t>Todos los popups usan fondo, iconos, tipografía y acciones consistentes con Auct.io.</w:t>
+      </w:r>
+    </w:p>
+    <w:p>
+      <w:pPr>
+        <w:pStyle w:val="ListBullet"/>
+        <w:spacing w:after="80" w:line="300" w:lineRule="auto"/>
+        <w:ind w:left="540" w:hanging="271"/>
+      </w:pPr>
+      <w:r>
+        <w:rPr>
+          <w:rFonts w:ascii="Calibri" w:hAnsi="Calibri"/>
+          <w:color w:val="071827"/>
+          <w:sz w:val="21"/>
+        </w:rPr>
+        <w:t>Los iconos administrativos representan su acción, tienen tamaño uniforme y descripción accesible.</w:t>
       </w:r>
     </w:p>
     <w:p>
@@ -6081,6 +6513,150 @@
   </w:num>
   <w:num w:numId="9">
     <w:abstractNumId w:val="0"/>
+  </w:num>
+  <w:abstractNum w:abstractNumId="9">
+    <w:multiLevelType w:val="singleLevel"/>
+    <w:lvl w:ilvl="0">
+      <w:start w:val="1"/>
+      <w:numFmt w:val="decimal"/>
+      <w:lvlText w:val="%1."/>
+      <w:suff w:val="tab"/>
+      <w:pPr>
+        <w:tabs>
+          <w:tab w:val="num" w:pos="540"/>
+        </w:tabs>
+        <w:ind w:left="540" w:hanging="270"/>
+      </w:pPr>
+    </w:lvl>
+  </w:abstractNum>
+  <w:num w:numId="10">
+    <w:abstractNumId w:val="9"/>
+  </w:num>
+  <w:abstractNum w:abstractNumId="10">
+    <w:multiLevelType w:val="singleLevel"/>
+    <w:lvl w:ilvl="0">
+      <w:start w:val="1"/>
+      <w:numFmt w:val="decimal"/>
+      <w:lvlText w:val="%1."/>
+      <w:suff w:val="tab"/>
+      <w:pPr>
+        <w:tabs>
+          <w:tab w:val="num" w:pos="540"/>
+        </w:tabs>
+        <w:ind w:left="540" w:hanging="270"/>
+      </w:pPr>
+    </w:lvl>
+  </w:abstractNum>
+  <w:num w:numId="11">
+    <w:abstractNumId w:val="10"/>
+  </w:num>
+  <w:abstractNum w:abstractNumId="11">
+    <w:multiLevelType w:val="singleLevel"/>
+    <w:lvl w:ilvl="0">
+      <w:start w:val="1"/>
+      <w:numFmt w:val="decimal"/>
+      <w:lvlText w:val="%1."/>
+      <w:suff w:val="tab"/>
+      <w:pPr>
+        <w:tabs>
+          <w:tab w:val="num" w:pos="540"/>
+        </w:tabs>
+        <w:ind w:left="540" w:hanging="270"/>
+      </w:pPr>
+    </w:lvl>
+  </w:abstractNum>
+  <w:num w:numId="12">
+    <w:abstractNumId w:val="11"/>
+  </w:num>
+  <w:abstractNum w:abstractNumId="12">
+    <w:multiLevelType w:val="singleLevel"/>
+    <w:lvl w:ilvl="0">
+      <w:start w:val="1"/>
+      <w:numFmt w:val="decimal"/>
+      <w:lvlText w:val="%1."/>
+      <w:suff w:val="tab"/>
+      <w:pPr>
+        <w:tabs>
+          <w:tab w:val="num" w:pos="540"/>
+        </w:tabs>
+        <w:ind w:left="540" w:hanging="270"/>
+      </w:pPr>
+    </w:lvl>
+  </w:abstractNum>
+  <w:num w:numId="13">
+    <w:abstractNumId w:val="12"/>
+  </w:num>
+  <w:abstractNum w:abstractNumId="13">
+    <w:multiLevelType w:val="singleLevel"/>
+    <w:lvl w:ilvl="0">
+      <w:start w:val="1"/>
+      <w:numFmt w:val="decimal"/>
+      <w:lvlText w:val="%1."/>
+      <w:suff w:val="tab"/>
+      <w:pPr>
+        <w:tabs>
+          <w:tab w:val="num" w:pos="540"/>
+        </w:tabs>
+        <w:ind w:left="540" w:hanging="270"/>
+      </w:pPr>
+    </w:lvl>
+  </w:abstractNum>
+  <w:num w:numId="14">
+    <w:abstractNumId w:val="13"/>
+  </w:num>
+  <w:abstractNum w:abstractNumId="14">
+    <w:multiLevelType w:val="singleLevel"/>
+    <w:lvl w:ilvl="0">
+      <w:start w:val="1"/>
+      <w:numFmt w:val="decimal"/>
+      <w:lvlText w:val="%1."/>
+      <w:suff w:val="tab"/>
+      <w:pPr>
+        <w:tabs>
+          <w:tab w:val="num" w:pos="540"/>
+        </w:tabs>
+        <w:ind w:left="540" w:hanging="270"/>
+      </w:pPr>
+    </w:lvl>
+  </w:abstractNum>
+  <w:num w:numId="15">
+    <w:abstractNumId w:val="14"/>
+  </w:num>
+  <w:abstractNum w:abstractNumId="15">
+    <w:multiLevelType w:val="singleLevel"/>
+    <w:lvl w:ilvl="0">
+      <w:start w:val="1"/>
+      <w:numFmt w:val="decimal"/>
+      <w:lvlText w:val="%1."/>
+      <w:suff w:val="tab"/>
+      <w:pPr>
+        <w:tabs>
+          <w:tab w:val="num" w:pos="540"/>
+        </w:tabs>
+        <w:ind w:left="540" w:hanging="270"/>
+      </w:pPr>
+    </w:lvl>
+  </w:abstractNum>
+  <w:num w:numId="16">
+    <w:abstractNumId w:val="15"/>
+  </w:num>
+  <w:abstractNum w:abstractNumId="16">
+    <w:multiLevelType w:val="singleLevel"/>
+    <w:lvl w:ilvl="0">
+      <w:start w:val="1"/>
+      <w:numFmt w:val="decimal"/>
+      <w:lvlText w:val="%1."/>
+      <w:suff w:val="tab"/>
+      <w:pPr>
+        <w:tabs>
+          <w:tab w:val="num" w:pos="540"/>
+        </w:tabs>
+        <w:ind w:left="540" w:hanging="270"/>
+      </w:pPr>
+    </w:lvl>
+  </w:abstractNum>
+  <w:num w:numId="17">
+    <w:abstractNumId w:val="16"/>
   </w:num>
 </w:numbering>
 </file>

</xml_diff>